<commit_message>
Adding most recent files to eportfolio
</commit_message>
<xml_diff>
--- a/professional_documents/Stanley_Southwick-CV.docx
+++ b/professional_documents/Stanley_Southwick-CV.docx
@@ -14,7 +14,7 @@
         <mc:AlternateContent>
           <mc:Choice Requires="wps">
             <w:drawing>
-              <wp:anchor distT="0" distB="0" distL="114300" distR="114300" simplePos="0" relativeHeight="251659264" behindDoc="1" locked="1" layoutInCell="1" allowOverlap="1" wp14:anchorId="33362109" wp14:editId="1F0EF6E6">
+              <wp:anchor distT="0" distB="0" distL="114300" distR="114300" simplePos="0" relativeHeight="251659264" behindDoc="1" locked="1" layoutInCell="1" allowOverlap="1" wp14:anchorId="42122419" wp14:editId="4CFF97F1">
                 <wp:simplePos x="0" y="0"/>
                 <wp:positionH relativeFrom="page">
                   <wp:posOffset>0</wp:posOffset>
@@ -91,7 +91,7 @@
           </mc:Choice>
           <mc:Fallback>
             <w:pict>
-              <v:rect w14:anchorId="38EFF3CE" id="Rectangle 2" o:spid="_x0000_s1026" alt="Decorative" style="position:absolute;margin-left:0;margin-top:-28.8pt;width:612pt;height:104.8pt;z-index:-251657216;visibility:visible;mso-wrap-style:square;mso-width-percent:0;mso-height-percent:0;mso-wrap-distance-left:9pt;mso-wrap-distance-top:0;mso-wrap-distance-right:9pt;mso-wrap-distance-bottom:0;mso-position-horizontal:absolute;mso-position-horizontal-relative:page;mso-position-vertical:absolute;mso-position-vertical-relative:text;mso-width-percent:0;mso-height-percent:0;mso-width-relative:margin;mso-height-relative:margin;v-text-anchor:middle" o:gfxdata="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" fillcolor="#5a5a5a [2109]" stroked="f" strokeweight="2pt">
+              <v:rect w14:anchorId="38EFF3CE" id="Rectangle 2" o:spid="_x0000_s1026" alt="Decorative" style="position:absolute;margin-left:0;margin-top:-28.8pt;width:612pt;height:104.8pt;z-index:-251657216;visibility:visible;mso-wrap-style:square;mso-width-percent:0;mso-height-percent:0;mso-wrap-distance-left:9pt;mso-wrap-distance-top:0;mso-wrap-distance-right:9pt;mso-wrap-distance-bottom:0;mso-position-horizontal:absolute;mso-position-horizontal-relative:page;mso-position-vertical:absolute;mso-position-vertical-relative:text;mso-width-percent:0;mso-height-percent:0;mso-width-relative:margin;mso-height-relative:margin;v-text-anchor:middle" o:gfxdata="UEsDBBQABgAIAAAAIQC2gziS/gAAAOEBAAATAAAAW0NvbnRlbnRfVHlwZXNdLnhtbJSRQU7DMBBF 90jcwfIWJU67QAgl6YK0S0CoHGBkTxKLZGx5TGhvj5O2G0SRWNoz/78nu9wcxkFMGNg6quQqL6RA 0s5Y6ir5vt9lD1JwBDIwOMJKHpHlpr69KfdHjyxSmriSfYz+USnWPY7AufNIadK6MEJMx9ApD/oD OlTrorhX2lFEilmcO2RdNtjC5xDF9pCuTyYBB5bi6bQ4syoJ3g9WQ0ymaiLzg5KdCXlKLjvcW893 SUOqXwnz5DrgnHtJTxOsQfEKIT7DmDSUCaxw7Rqn8787ZsmRM9e2VmPeBN4uqYvTtW7jvijg9N/y JsXecLq0q+WD6m8AAAD//wMAUEsDBBQABgAIAAAAIQA4/SH/1gAAAJQBAAALAAAAX3JlbHMvLnJl bHOkkMFqwzAMhu+DvYPRfXGawxijTi+j0GvpHsDYimMaW0Yy2fr2M4PBMnrbUb/Q94l/f/hMi1qR JVI2sOt6UJgd+ZiDgffL8ekFlFSbvV0oo4EbChzGx4f9GRdb25HMsYhqlCwG5lrLq9biZkxWOiqY 22YiTra2kYMu1l1tQD30/bPm3wwYN0x18gb45AdQl1tp5j/sFB2T0FQ7R0nTNEV3j6o9feQzro1i OWA14Fm+Q8a1a8+Bvu/d/dMb2JY5uiPbhG/ktn4cqGU/er3pcvwCAAD//wMAUEsDBBQABgAIAAAA IQBU6eD3lQIAAJoFAAAOAAAAZHJzL2Uyb0RvYy54bWysVN9P2zAQfp+0/8Hy+0haCh0VKapATJMY VIOJZ+PYJJLt82y3affX72wnKTC0h2kviX0/vrv7fHfnFzutyFY434Kp6OSopEQYDnVrniv64+H6 02dKfGCmZgqMqOheeHqx/PjhvLMLMYUGVC0cQRDjF52taBOCXRSF543QzB+BFQaVEpxmAa/uuagd 6xBdq2JalqdFB662DrjwHqVXWUmXCV9KwcOdlF4EoiqKuYX0den7FL/F8pwtnh2zTcv7NNg/ZKFZ azDoCHXFAiMb1/4BpVvuwIMMRxx0AVK2XKQasJpJ+aaa+4ZZkWpBcrwdafL/D5bfbu/t2iENnfUL j8dYxU46Hf+YH9klsvYjWWIXCEfhfD6fzkrklKNucnxcnp0mOouDu3U+fBGgSTxU1OFrJJLY9sYH DImmg0mM5kG19XWrVLrEDhCXypEtw7cLu0lyVRv9DeosOz0pMX56QRTjO2fx8SBG+NRHESUFexVA mRjGQAyYc4mS4kBDOoW9EtFOme9CkrbGwqcpkRE5B2WcCxNyjr5htcjimMrAyuiRckmAEVli/BG7 B3hd+4Cds+zto6tIDT46l39LLDuPHikymDA669aAew9AYVV95Gw/kJSpiSw9Qb1fO+Igj5e3/LrF F79hPqyZw3nCLsEdEe7wIxV0FYX+REkD7td78miPbY5aSjqcz4r6nxvmBCXqq8EBOJvMZnGg02V2 Mp/ixb3UPL3UmI2+BGyjCW4jy9Mx2gc1HKUD/YirZBWjoooZjrEryoMbLpch7w1cRlysVskMh9iy cGPuLY/gkdXY0Q+7R+Zs3/YBJ+YWhllmizfdn22jp4HVJoBs02gceO35xgWQGqdfVnHDvLwnq8NK Xf4GAAD//wMAUEsDBBQABgAIAAAAIQDhH0k23wAAAA4BAAAPAAAAZHJzL2Rvd25yZXYueG1sTE/N TsMwDL4j8Q6RkbhtCREr0DWdUPm5IUHoA2SNaSuapGqyreXp8U5wsWx/9vdT7GY3sCNOsQ9ewc1a AEPfBNv7VkH9+bK6BxaT8dYMwaOCBSPsysuLwuQ2nPwHHnVqGZH4mBsFXUpjznlsOnQmrsOInrCv MDmTaJxabidzInI3cClExp3pPSl0ZsSqw+ZbH5wC8fr+rJcfWWP1oOuYLZq/tZVS11fz05bK4xZY wjn9fcA5A/mHkoztw8HbyAYiojsFq81dBuwMS3lLqz11GymAlwX/H6P8BQAA//8DAFBLAQItABQA BgAIAAAAIQC2gziS/gAAAOEBAAATAAAAAAAAAAAAAAAAAAAAAABbQ29udGVudF9UeXBlc10ueG1s UEsBAi0AFAAGAAgAAAAhADj9If/WAAAAlAEAAAsAAAAAAAAAAAAAAAAALwEAAF9yZWxzLy5yZWxz UEsBAi0AFAAGAAgAAAAhAFTp4PeVAgAAmgUAAA4AAAAAAAAAAAAAAAAALgIAAGRycy9lMm9Eb2Mu eG1sUEsBAi0AFAAGAAgAAAAhAOEfSTbfAAAADgEAAA8AAAAAAAAAAAAAAAAA7wQAAGRycy9kb3du cmV2LnhtbFBLBQYAAAAABAAEAPMAAAD7BQAAAAA= " fillcolor="#5a5a5a [2109]" stroked="f" strokeweight="2pt">
                 <w10:wrap anchorx="page"/>
                 <w10:anchorlock/>
               </v:rect>
@@ -114,12 +114,12 @@
         <w:tblCaption w:val="Resume layout table"/>
       </w:tblPr>
       <w:tblGrid>
-        <w:gridCol w:w="1712"/>
-        <w:gridCol w:w="2503"/>
-        <w:gridCol w:w="5804"/>
-        <w:gridCol w:w="10"/>
+        <w:gridCol w:w="1844"/>
+        <w:gridCol w:w="2628"/>
+        <w:gridCol w:w="5408"/>
+        <w:gridCol w:w="11"/>
         <w:gridCol w:w="6"/>
-        <w:gridCol w:w="45"/>
+        <w:gridCol w:w="183"/>
       </w:tblGrid>
       <w:tr>
         <w:trPr>
@@ -134,33 +134,27 @@
             <w:pPr>
               <w:pStyle w:val="Title"/>
               <w:rPr>
+                <w:rFonts w:ascii="Arial" w:hAnsi="Arial" w:cs="Arial"/>
                 <w:sz w:val="24"/>
                 <w:szCs w:val="28"/>
               </w:rPr>
             </w:pPr>
             <w:r>
               <w:rPr>
+                <w:rFonts w:ascii="Arial" w:hAnsi="Arial" w:cs="Arial"/>
                 <w:sz w:val="24"/>
                 <w:szCs w:val="28"/>
               </w:rPr>
-              <w:t>Stan</w:t>
-            </w:r>
-            <w:r>
-              <w:rPr>
-                <w:sz w:val="24"/>
-                <w:szCs w:val="28"/>
-              </w:rPr>
-              <w:t>ley</w:t>
-            </w:r>
-            <w:r>
-              <w:rPr>
-                <w:sz w:val="24"/>
-                <w:szCs w:val="28"/>
-              </w:rPr>
-              <w:t xml:space="preserve"> Southwick</w:t>
-            </w:r>
-          </w:p>
-          <w:p/>
+              <w:t>Stanley Southwick</w:t>
+            </w:r>
+          </w:p>
+          <w:p>
+            <w:pPr>
+              <w:rPr>
+                <w:rFonts w:ascii="Arial" w:hAnsi="Arial" w:cs="Arial"/>
+              </w:rPr>
+            </w:pPr>
+          </w:p>
         </w:tc>
         <w:tc>
           <w:tcPr>
@@ -173,55 +167,41 @@
               <w:pStyle w:val="Subtitle"/>
               <w:ind w:right="80"/>
               <w:jc w:val="right"/>
-            </w:pPr>
-            <w:r>
-              <w:rPr>
+              <w:rPr>
+                <w:rFonts w:ascii="Arial" w:hAnsi="Arial" w:cs="Arial"/>
+              </w:rPr>
+            </w:pPr>
+            <w:r>
+              <w:rPr>
+                <w:rFonts w:ascii="Arial" w:hAnsi="Arial" w:cs="Arial"/>
                 <w:sz w:val="16"/>
                 <w:szCs w:val="21"/>
               </w:rPr>
-              <w:t>Cyber</w:t>
-            </w:r>
-            <w:r>
-              <w:rPr>
+              <w:t xml:space="preserve">ML &amp; AI Engineer // Defence &amp; Security | </w:t>
+            </w:r>
+            <w:r>
+              <w:rPr>
+                <w:rFonts w:ascii="Arial" w:hAnsi="Arial" w:cs="Arial"/>
                 <w:sz w:val="16"/>
                 <w:szCs w:val="21"/>
               </w:rPr>
-              <w:t xml:space="preserve"> &amp; Networking</w:t>
-            </w:r>
-            <w:r>
-              <w:rPr>
+              <w:t>Government</w:t>
+            </w:r>
+            <w:r>
+              <w:rPr>
+                <w:rFonts w:ascii="Arial" w:hAnsi="Arial" w:cs="Arial"/>
                 <w:sz w:val="16"/>
                 <w:szCs w:val="21"/>
               </w:rPr>
-              <w:t xml:space="preserve"> </w:t>
-            </w:r>
-            <w:r>
-              <w:rPr>
+              <w:t xml:space="preserve"> Clear</w:t>
+            </w:r>
+            <w:r>
+              <w:rPr>
+                <w:rFonts w:ascii="Arial" w:hAnsi="Arial" w:cs="Arial"/>
                 <w:sz w:val="16"/>
                 <w:szCs w:val="21"/>
               </w:rPr>
-              <w:t>Professional</w:t>
-            </w:r>
-            <w:r>
-              <w:rPr>
-                <w:sz w:val="16"/>
-                <w:szCs w:val="21"/>
-              </w:rPr>
-              <w:t xml:space="preserve"> </w:t>
-            </w:r>
-            <w:r>
-              <w:rPr>
-                <w:sz w:val="16"/>
-                <w:szCs w:val="21"/>
-              </w:rPr>
-              <w:t xml:space="preserve">// </w:t>
-            </w:r>
-            <w:r>
-              <w:rPr>
-                <w:sz w:val="16"/>
-                <w:szCs w:val="21"/>
-              </w:rPr>
-              <w:t>Moving into ML/ data-driven engineering</w:t>
+              <w:t>ances</w:t>
             </w:r>
           </w:p>
         </w:tc>
@@ -241,6 +221,9 @@
           <w:p>
             <w:pPr>
               <w:pStyle w:val="Heading1"/>
+              <w:rPr>
+                <w:rFonts w:ascii="Arial" w:hAnsi="Arial" w:cs="Arial"/>
+              </w:rPr>
             </w:pPr>
           </w:p>
         </w:tc>
@@ -262,8 +245,14 @@
           <w:p>
             <w:pPr>
               <w:pStyle w:val="Heading2"/>
-            </w:pPr>
-            <w:r>
+              <w:rPr>
+                <w:rFonts w:ascii="Arial" w:hAnsi="Arial" w:cs="Arial"/>
+              </w:rPr>
+            </w:pPr>
+            <w:r>
+              <w:rPr>
+                <w:rFonts w:ascii="Arial" w:hAnsi="Arial" w:cs="Arial"/>
+              </w:rPr>
               <w:t xml:space="preserve"> </w:t>
             </w:r>
           </w:p>
@@ -278,97 +267,52 @@
             </w:tcBorders>
           </w:tcPr>
           <w:p>
-            <w:r>
+            <w:pPr>
+              <w:rPr>
+                <w:rFonts w:ascii="Arial" w:hAnsi="Arial" w:cs="Arial"/>
+              </w:rPr>
+            </w:pPr>
+            <w:r>
+              <w:rPr>
+                <w:rFonts w:ascii="Arial" w:hAnsi="Arial" w:cs="Arial"/>
+              </w:rPr>
               <w:t xml:space="preserve">A </w:t>
             </w:r>
             <w:r>
-              <w:t xml:space="preserve">DV (Developed vetting) cleared </w:t>
-            </w:r>
-            <w:r>
-              <w:t xml:space="preserve">engineer </w:t>
-            </w:r>
-            <w:r>
-              <w:t>with 7 years’ experience in a military environment covering cyber assurance and network operations</w:t>
-            </w:r>
-            <w:r>
-              <w:t xml:space="preserve"> in high-security operational environments.</w:t>
-            </w:r>
-            <w:r>
-              <w:t xml:space="preserve"> </w:t>
-            </w:r>
-            <w:r>
-              <w:t>T</w:t>
-            </w:r>
-            <w:r>
-              <w:t>ransitioning into machine</w:t>
-            </w:r>
-            <w:r>
-              <w:t xml:space="preserve"> </w:t>
-            </w:r>
-            <w:r>
-              <w:t>learning and data-driven engineering</w:t>
-            </w:r>
-            <w:r>
-              <w:t xml:space="preserve"> from my current experience in the military, </w:t>
-            </w:r>
-            <w:r>
-              <w:t>I bring a unique</w:t>
-            </w:r>
-            <w:r>
-              <w:t xml:space="preserve"> background</w:t>
-            </w:r>
-            <w:r>
-              <w:t xml:space="preserve"> of operational security</w:t>
-            </w:r>
-            <w:r>
-              <w:t>, c</w:t>
-            </w:r>
-            <w:r>
-              <w:t xml:space="preserve">omplemented </w:t>
-            </w:r>
-            <w:r>
-              <w:t>by</w:t>
-            </w:r>
-            <w:r>
-              <w:t xml:space="preserve"> </w:t>
-            </w:r>
-            <w:r>
-              <w:t>an</w:t>
-            </w:r>
-            <w:r>
-              <w:t xml:space="preserve"> ongoing MSc </w:t>
-            </w:r>
-            <w:r>
-              <w:t xml:space="preserve">in </w:t>
-            </w:r>
-            <w:proofErr w:type="spellStart"/>
-            <w:r>
-              <w:t>AI</w:t>
-            </w:r>
-            <w:proofErr w:type="spellEnd"/>
-            <w:r>
-              <w:t xml:space="preserve"> and</w:t>
-            </w:r>
-            <w:r>
-              <w:t xml:space="preserve"> </w:t>
-            </w:r>
-            <w:r>
-              <w:t xml:space="preserve">portfolio projects demonstrating </w:t>
-            </w:r>
-            <w:r>
-              <w:t>production</w:t>
-            </w:r>
-            <w:r>
-              <w:t>-</w:t>
-            </w:r>
-            <w:r>
-              <w:t xml:space="preserve">ready skills </w:t>
-            </w:r>
-            <w:r>
-              <w:t>in Python, Docker, AWS and APIs</w:t>
-            </w:r>
-            <w:r>
-              <w:t>.</w:t>
+              <w:rPr>
+                <w:rFonts w:ascii="Arial" w:hAnsi="Arial" w:cs="Arial"/>
+              </w:rPr>
+              <w:t xml:space="preserve">Government </w:t>
+            </w:r>
+            <w:r>
+              <w:rPr>
+                <w:rFonts w:ascii="Arial" w:hAnsi="Arial" w:cs="Arial"/>
+              </w:rPr>
+              <w:t xml:space="preserve">cleared engineer building a focused career in machine learning and AI engineering, backed by </w:t>
+            </w:r>
+            <w:r>
+              <w:rPr>
+                <w:rFonts w:ascii="Arial" w:hAnsi="Arial" w:cs="Arial"/>
+              </w:rPr>
+              <w:t xml:space="preserve">6 + </w:t>
+            </w:r>
+            <w:r>
+              <w:rPr>
+                <w:rFonts w:ascii="Arial" w:hAnsi="Arial" w:cs="Arial"/>
+              </w:rPr>
+              <w:t xml:space="preserve">years’ experience in high-security military environments. Combining hands-on production ML projects in Python, AWS, and Docker with an ongoing MSc in AI at the University of Essex, I bring </w:t>
+            </w:r>
+            <w:r>
+              <w:rPr>
+                <w:rFonts w:ascii="Arial" w:hAnsi="Arial" w:cs="Arial"/>
+              </w:rPr>
+              <w:t xml:space="preserve">a demonstrated Machine learning </w:t>
+            </w:r>
+            <w:r>
+              <w:rPr>
+                <w:rFonts w:ascii="Arial" w:hAnsi="Arial" w:cs="Arial"/>
+              </w:rPr>
+              <w:t>capability alongside deep operational security domain knowledge. My background managing complex data infrastructure, enforcing data governance, and delivering under mission-critical conditions translates directly into the rigorous, security-aware approach these roles demand.</w:t>
             </w:r>
           </w:p>
         </w:tc>
@@ -380,14 +324,176 @@
               <w:bottom w:val="single" w:sz="8" w:space="0" w:color="000000" w:themeColor="text1"/>
             </w:tcBorders>
           </w:tcPr>
-          <w:p/>
+          <w:p>
+            <w:pPr>
+              <w:rPr>
+                <w:rFonts w:ascii="Arial" w:hAnsi="Arial" w:cs="Arial"/>
+              </w:rPr>
+            </w:pPr>
+          </w:p>
         </w:tc>
       </w:tr>
       <w:tr>
         <w:trPr>
           <w:gridAfter w:val="2"/>
           <w:wAfter w:w="279" w:type="dxa"/>
-          <w:trHeight w:val="6222"/>
+        </w:trPr>
+        <w:tc>
+          <w:tcPr>
+            <w:tcW w:w="1844" w:type="dxa"/>
+            <w:tcBorders>
+              <w:top w:val="single" w:sz="8" w:space="0" w:color="000000" w:themeColor="text1"/>
+              <w:bottom w:val="single" w:sz="8" w:space="0" w:color="000000" w:themeColor="text1"/>
+            </w:tcBorders>
+          </w:tcPr>
+          <w:p>
+            <w:pPr>
+              <w:pStyle w:val="Heading2"/>
+              <w:rPr>
+                <w:rFonts w:ascii="Arial" w:hAnsi="Arial" w:cs="Arial"/>
+              </w:rPr>
+            </w:pPr>
+            <w:r>
+              <w:rPr>
+                <w:rFonts w:ascii="Arial" w:hAnsi="Arial" w:cs="Arial"/>
+              </w:rPr>
+              <w:t>Key Skills</w:t>
+            </w:r>
+          </w:p>
+        </w:tc>
+        <w:tc>
+          <w:tcPr>
+            <w:tcW w:w="8219" w:type="dxa"/>
+            <w:gridSpan w:val="2"/>
+            <w:tcBorders>
+              <w:top w:val="single" w:sz="8" w:space="0" w:color="000000" w:themeColor="text1"/>
+              <w:bottom w:val="single" w:sz="8" w:space="0" w:color="000000" w:themeColor="text1"/>
+            </w:tcBorders>
+          </w:tcPr>
+          <w:p>
+            <w:pPr>
+              <w:rPr>
+                <w:rFonts w:ascii="Arial" w:hAnsi="Arial" w:cs="Arial"/>
+              </w:rPr>
+            </w:pPr>
+            <w:r>
+              <w:rPr>
+                <w:rFonts w:ascii="Arial" w:hAnsi="Arial" w:cs="Arial"/>
+                <w:b/>
+                <w:bCs/>
+              </w:rPr>
+              <w:t xml:space="preserve">ML &amp; Data: </w:t>
+            </w:r>
+            <w:r>
+              <w:rPr>
+                <w:rFonts w:ascii="Arial" w:hAnsi="Arial" w:cs="Arial"/>
+              </w:rPr>
+              <w:t>Python (scikit-learn, Pandas, NumPy, Matplotlib) | EDA &amp; Feature Engineering | Classification | Regression | Anomaly Detection | ML pipelines</w:t>
+            </w:r>
+          </w:p>
+          <w:p>
+            <w:pPr>
+              <w:rPr>
+                <w:rFonts w:ascii="Arial" w:hAnsi="Arial" w:cs="Arial"/>
+              </w:rPr>
+            </w:pPr>
+            <w:r>
+              <w:rPr>
+                <w:rFonts w:ascii="Arial" w:hAnsi="Arial" w:cs="Arial"/>
+                <w:b/>
+                <w:bCs/>
+              </w:rPr>
+              <w:t xml:space="preserve">Deployment &amp; Infrastructure: </w:t>
+            </w:r>
+            <w:r>
+              <w:rPr>
+                <w:rFonts w:ascii="Arial" w:hAnsi="Arial" w:cs="Arial"/>
+              </w:rPr>
+              <w:t xml:space="preserve">AWS (EC2, S3) | Docker | </w:t>
+            </w:r>
+            <w:r>
+              <w:rPr>
+                <w:rFonts w:ascii="Arial" w:hAnsi="Arial" w:cs="Arial"/>
+              </w:rPr>
+              <w:t>Fast</w:t>
+            </w:r>
+            <w:r>
+              <w:rPr>
+                <w:rFonts w:ascii="Arial" w:hAnsi="Arial" w:cs="Arial"/>
+              </w:rPr>
+              <w:t>API | Git | Linux / Red Hat</w:t>
+            </w:r>
+          </w:p>
+          <w:p>
+            <w:pPr>
+              <w:rPr>
+                <w:rFonts w:ascii="Arial" w:hAnsi="Arial" w:cs="Arial"/>
+              </w:rPr>
+            </w:pPr>
+            <w:r>
+              <w:rPr>
+                <w:rFonts w:ascii="Arial" w:hAnsi="Arial" w:cs="Arial"/>
+                <w:b/>
+                <w:bCs/>
+              </w:rPr>
+              <w:t xml:space="preserve">Domain: </w:t>
+            </w:r>
+            <w:r>
+              <w:rPr>
+                <w:rFonts w:ascii="Arial" w:hAnsi="Arial" w:cs="Arial"/>
+              </w:rPr>
+              <w:t>Cyber Assurance | Network Security | Data Governance | Defence &amp; Security environments</w:t>
+            </w:r>
+          </w:p>
+          <w:p>
+            <w:pPr>
+              <w:rPr>
+                <w:rFonts w:ascii="Arial" w:hAnsi="Arial" w:cs="Arial"/>
+              </w:rPr>
+            </w:pPr>
+            <w:r>
+              <w:rPr>
+                <w:rFonts w:ascii="Arial" w:hAnsi="Arial" w:cs="Arial"/>
+                <w:b/>
+                <w:bCs/>
+              </w:rPr>
+              <w:t xml:space="preserve">Tools &amp; Methods: </w:t>
+            </w:r>
+            <w:r>
+              <w:rPr>
+                <w:rFonts w:ascii="Arial" w:hAnsi="Arial" w:cs="Arial"/>
+              </w:rPr>
+              <w:t xml:space="preserve">Jira | Confluence | Grafana | AgilePM | </w:t>
+            </w:r>
+            <w:r>
+              <w:rPr>
+                <w:rFonts w:ascii="Arial" w:hAnsi="Arial" w:cs="Arial"/>
+              </w:rPr>
+              <w:t>MLFlow | Git | VSCode</w:t>
+            </w:r>
+          </w:p>
+        </w:tc>
+        <w:tc>
+          <w:tcPr>
+            <w:tcW w:w="6" w:type="dxa"/>
+            <w:tcBorders>
+              <w:top w:val="single" w:sz="8" w:space="0" w:color="000000" w:themeColor="text1"/>
+              <w:bottom w:val="single" w:sz="8" w:space="0" w:color="000000" w:themeColor="text1"/>
+            </w:tcBorders>
+          </w:tcPr>
+          <w:p>
+            <w:pPr>
+              <w:rPr>
+                <w:rFonts w:ascii="Arial" w:hAnsi="Arial" w:cs="Arial"/>
+              </w:rPr>
+            </w:pPr>
+          </w:p>
+        </w:tc>
+      </w:tr>
+      <w:tr>
+        <w:trPr>
+          <w:gridAfter w:val="2"/>
+          <w:wAfter w:w="279" w:type="dxa"/>
         </w:trPr>
         <w:tc>
           <w:tcPr>
@@ -399,9 +505,15 @@
           <w:p>
             <w:pPr>
               <w:pStyle w:val="Heading2"/>
+              <w:rPr>
+                <w:rFonts w:ascii="Arial" w:hAnsi="Arial" w:cs="Arial"/>
+              </w:rPr>
             </w:pPr>
             <w:sdt>
               <w:sdtPr>
+                <w:rPr>
+                  <w:rFonts w:ascii="Arial" w:hAnsi="Arial" w:cs="Arial"/>
+                </w:rPr>
                 <w:id w:val="-297150969"/>
                 <w:placeholder>
                   <w:docPart w:val="861A924122184B6BBE3596376A624CE0"/>
@@ -412,6 +524,9 @@
               </w:sdtPr>
               <w:sdtContent>
                 <w:r>
+                  <w:rPr>
+                    <w:rFonts w:ascii="Arial" w:hAnsi="Arial" w:cs="Arial"/>
+                  </w:rPr>
                   <w:t>Experience</w:t>
                 </w:r>
               </w:sdtContent>
@@ -430,105 +545,83 @@
             <w:pPr>
               <w:pStyle w:val="Heading3"/>
               <w:rPr>
+                <w:rFonts w:ascii="Arial" w:hAnsi="Arial" w:cs="Arial"/>
                 <w:szCs w:val="20"/>
               </w:rPr>
             </w:pPr>
             <w:r>
               <w:rPr>
+                <w:rFonts w:ascii="Arial" w:hAnsi="Arial" w:cs="Arial"/>
                 <w:szCs w:val="20"/>
               </w:rPr>
-              <w:t>Royal Air force – cyber &amp; networking</w:t>
-            </w:r>
-            <w:r>
-              <w:rPr>
+              <w:t>Royal Air Force – Cyber, Data &amp; Network Engineering (DV Cleared)</w:t>
+            </w:r>
+          </w:p>
+          <w:p>
+            <w:pPr>
+              <w:rPr>
+                <w:rStyle w:val="Strong"/>
+                <w:rFonts w:ascii="Arial" w:hAnsi="Arial" w:cs="Arial"/>
+              </w:rPr>
+            </w:pPr>
+            <w:r>
+              <w:rPr>
+                <w:rStyle w:val="Strong"/>
+                <w:rFonts w:ascii="Arial" w:hAnsi="Arial" w:cs="Arial"/>
+              </w:rPr>
+              <w:t>Lincoln, UK // Cyprus // UAE // 2020 - Present</w:t>
+            </w:r>
+          </w:p>
+          <w:p>
+            <w:pPr>
+              <w:rPr>
+                <w:rFonts w:ascii="Arial" w:hAnsi="Arial" w:cs="Arial"/>
+              </w:rPr>
+            </w:pPr>
+          </w:p>
+          <w:p>
+            <w:pPr>
+              <w:rPr>
+                <w:rFonts w:ascii="Arial" w:hAnsi="Arial" w:cs="Arial"/>
+              </w:rPr>
+            </w:pPr>
+            <w:r>
+              <w:rPr>
+                <w:rFonts w:ascii="Arial" w:hAnsi="Arial" w:cs="Arial"/>
+              </w:rPr>
+              <w:t xml:space="preserve">Part of a cyber assurance and auditing team at a major RAF base, responsible for compliance auditing, asset data management, and the strategic rollout of software and hardware. Subsequently </w:t>
+            </w:r>
+            <w:r>
+              <w:rPr>
+                <w:rFonts w:ascii="Arial" w:hAnsi="Arial" w:cs="Arial"/>
+              </w:rPr>
+              <w:t>posted</w:t>
+            </w:r>
+            <w:r>
+              <w:rPr>
+                <w:rFonts w:ascii="Arial" w:hAnsi="Arial" w:cs="Arial"/>
+              </w:rPr>
+              <w:t xml:space="preserve"> to Cyprus as part of a high-stakes network engineering team managing an infrastructure of over 650 digital assets including data centres and an in-house cloud network, operating with near-zero downtime requirements in a classified environment.</w:t>
+            </w:r>
+          </w:p>
+          <w:p>
+            <w:pPr>
+              <w:rPr>
+                <w:rFonts w:ascii="Arial" w:hAnsi="Arial" w:cs="Arial"/>
+              </w:rPr>
+            </w:pPr>
+          </w:p>
+          <w:p>
+            <w:pPr>
+              <w:pStyle w:val="Heading3"/>
+              <w:rPr>
+                <w:rFonts w:ascii="Arial" w:hAnsi="Arial" w:cs="Arial"/>
                 <w:szCs w:val="20"/>
               </w:rPr>
-              <w:t xml:space="preserve"> (Government clearances)</w:t>
-            </w:r>
-          </w:p>
-          <w:p>
-            <w:pPr>
-              <w:rPr>
-                <w:rStyle w:val="Strong"/>
-              </w:rPr>
-            </w:pPr>
-            <w:r>
-              <w:rPr>
-                <w:rStyle w:val="Strong"/>
-              </w:rPr>
-              <w:t>Lincoln, UK</w:t>
-            </w:r>
-            <w:r>
-              <w:rPr>
-                <w:rStyle w:val="Strong"/>
-              </w:rPr>
-              <w:t xml:space="preserve"> </w:t>
-            </w:r>
-            <w:r>
-              <w:rPr>
-                <w:rStyle w:val="Strong"/>
-              </w:rPr>
-              <w:t xml:space="preserve">// </w:t>
-            </w:r>
-            <w:r>
-              <w:rPr>
-                <w:rStyle w:val="Strong"/>
-              </w:rPr>
-              <w:t>Cyprus</w:t>
-            </w:r>
-            <w:r>
-              <w:rPr>
-                <w:rStyle w:val="Strong"/>
-              </w:rPr>
-              <w:t xml:space="preserve"> </w:t>
-            </w:r>
-            <w:r>
-              <w:rPr>
-                <w:rStyle w:val="Strong"/>
-              </w:rPr>
-              <w:t xml:space="preserve">// </w:t>
-            </w:r>
-            <w:r>
-              <w:rPr>
-                <w:rStyle w:val="Strong"/>
-              </w:rPr>
-              <w:t>UAE // 2020 - Present</w:t>
-            </w:r>
-          </w:p>
-          <w:p/>
-          <w:p>
-            <w:r>
-              <w:t>Part of a cyber assurance/ auditing team for the base delivering cyber awareness training, auditing sections to make sure they w</w:t>
-            </w:r>
-            <w:r>
-              <w:t>ere</w:t>
-            </w:r>
-            <w:r>
-              <w:t xml:space="preserve"> compliant with military policies and asset tracking critical equipment</w:t>
-            </w:r>
-            <w:r>
-              <w:t xml:space="preserve"> and implementing strategic rollout of software/ hardware</w:t>
-            </w:r>
-            <w:r>
-              <w:t xml:space="preserve">. Departing to Cyprus as part of a high-stake networking team with over 650 digital equipment including data centers and </w:t>
-            </w:r>
-            <w:r>
-              <w:t xml:space="preserve">an </w:t>
-            </w:r>
-            <w:r>
-              <w:t>in-house cloud network.</w:t>
-            </w:r>
-          </w:p>
-          <w:p/>
-          <w:p>
-            <w:pPr>
-              <w:pStyle w:val="Heading3"/>
-              <w:rPr>
-                <w:szCs w:val="20"/>
-              </w:rPr>
-            </w:pPr>
-            <w:r>
-              <w:rPr>
+            </w:pPr>
+            <w:r>
+              <w:rPr>
+                <w:rFonts w:ascii="Arial" w:hAnsi="Arial" w:cs="Arial"/>
                 <w:szCs w:val="20"/>
               </w:rPr>
               <w:t>Skills Gained</w:t>
@@ -542,39 +635,63 @@
                 <w:numId w:val="4"/>
               </w:numPr>
               <w:rPr>
-                <w:rFonts w:asciiTheme="minorHAnsi" w:hAnsiTheme="minorHAnsi"/>
+                <w:rFonts w:ascii="Arial" w:hAnsi="Arial" w:cs="Arial"/>
                 <w:sz w:val="20"/>
                 <w:szCs w:val="20"/>
               </w:rPr>
             </w:pPr>
             <w:r>
               <w:rPr>
-                <w:rFonts w:asciiTheme="minorHAnsi" w:hAnsiTheme="minorHAnsi"/>
+                <w:rFonts w:ascii="Arial" w:hAnsi="Arial" w:cs="Arial"/>
                 <w:b/>
                 <w:bCs/>
                 <w:sz w:val="20"/>
                 <w:szCs w:val="20"/>
               </w:rPr>
-              <w:t>Performing at an operational level</w:t>
-            </w:r>
-            <w:r>
-              <w:rPr>
-                <w:rFonts w:asciiTheme="minorHAnsi" w:hAnsiTheme="minorHAnsi"/>
+              <w:t>Data-driven security operations</w:t>
+            </w:r>
+            <w:r>
+              <w:rPr>
+                <w:rFonts w:ascii="Arial" w:hAnsi="Arial" w:cs="Arial"/>
                 <w:sz w:val="20"/>
                 <w:szCs w:val="20"/>
               </w:rPr>
-              <w:t xml:space="preserve"> – I was able to lead large scale information security upgrades throughout an overseas deployment ensuring operational data was migrated and stored securely without any data loss.</w:t>
-            </w:r>
-          </w:p>
-          <w:p>
-            <w:pPr>
-              <w:pStyle w:val="ListParagraph"/>
-              <w:rPr>
-                <w:rFonts w:asciiTheme="minorHAnsi" w:hAnsiTheme="minorHAnsi"/>
+              <w:t xml:space="preserve"> –</w:t>
+            </w:r>
+            <w:r>
+              <w:rPr>
+                <w:rFonts w:ascii="Arial" w:hAnsi="Arial" w:cs="Arial"/>
                 <w:sz w:val="20"/>
                 <w:szCs w:val="20"/>
               </w:rPr>
-            </w:pPr>
+              <w:t xml:space="preserve">Part of </w:t>
+            </w:r>
+            <w:proofErr w:type="gramStart"/>
+            <w:r>
+              <w:rPr>
+                <w:rFonts w:ascii="Arial" w:hAnsi="Arial" w:cs="Arial"/>
+                <w:sz w:val="20"/>
+                <w:szCs w:val="20"/>
+              </w:rPr>
+              <w:t>a</w:t>
+            </w:r>
+            <w:proofErr w:type="gramEnd"/>
+            <w:r>
+              <w:rPr>
+                <w:rFonts w:ascii="Arial" w:hAnsi="Arial" w:cs="Arial"/>
+                <w:sz w:val="20"/>
+                <w:szCs w:val="20"/>
+              </w:rPr>
+              <w:t xml:space="preserve"> overseas deployment </w:t>
+            </w:r>
+            <w:r>
+              <w:rPr>
+                <w:rFonts w:ascii="Arial" w:hAnsi="Arial" w:cs="Arial"/>
+                <w:sz w:val="20"/>
+                <w:szCs w:val="20"/>
+              </w:rPr>
+              <w:t>information security upgrades, ensuring operational data was migrated and stored securely with zero data loss. Applied structured data governance principles across classified systems.</w:t>
+            </w:r>
           </w:p>
           <w:p>
             <w:pPr>
@@ -584,79 +701,29 @@
                 <w:numId w:val="4"/>
               </w:numPr>
               <w:rPr>
-                <w:rFonts w:asciiTheme="minorHAnsi" w:hAnsiTheme="minorHAnsi"/>
+                <w:rFonts w:ascii="Arial" w:hAnsi="Arial" w:cs="Arial"/>
                 <w:sz w:val="20"/>
                 <w:szCs w:val="20"/>
               </w:rPr>
             </w:pPr>
             <w:r>
               <w:rPr>
-                <w:rFonts w:asciiTheme="minorHAnsi" w:hAnsiTheme="minorHAnsi"/>
+                <w:rFonts w:ascii="Arial" w:hAnsi="Arial" w:cs="Arial"/>
                 <w:b/>
                 <w:bCs/>
                 <w:sz w:val="20"/>
                 <w:szCs w:val="20"/>
               </w:rPr>
-              <w:t>Adhe</w:t>
-            </w:r>
-            <w:r>
-              <w:rPr>
-                <w:rFonts w:asciiTheme="minorHAnsi" w:hAnsiTheme="minorHAnsi"/>
-                <w:b/>
-                <w:bCs/>
+              <w:t>Cyber compliance auditing and technical communication</w:t>
+            </w:r>
+            <w:r>
+              <w:rPr>
+                <w:rFonts w:ascii="Arial" w:hAnsi="Arial" w:cs="Arial"/>
                 <w:sz w:val="20"/>
                 <w:szCs w:val="20"/>
               </w:rPr>
-              <w:t>ring to</w:t>
-            </w:r>
-            <w:r>
-              <w:rPr>
-                <w:rFonts w:asciiTheme="minorHAnsi" w:hAnsiTheme="minorHAnsi"/>
-                <w:b/>
-                <w:bCs/>
-                <w:sz w:val="20"/>
-                <w:szCs w:val="20"/>
-              </w:rPr>
-              <w:t xml:space="preserve"> and enforc</w:t>
-            </w:r>
-            <w:r>
-              <w:rPr>
-                <w:rFonts w:asciiTheme="minorHAnsi" w:hAnsiTheme="minorHAnsi"/>
-                <w:b/>
-                <w:bCs/>
-                <w:sz w:val="20"/>
-                <w:szCs w:val="20"/>
-              </w:rPr>
-              <w:t>ing</w:t>
-            </w:r>
-            <w:r>
-              <w:rPr>
-                <w:rFonts w:asciiTheme="minorHAnsi" w:hAnsiTheme="minorHAnsi"/>
-                <w:b/>
-                <w:bCs/>
-                <w:sz w:val="20"/>
-                <w:szCs w:val="20"/>
-              </w:rPr>
-              <w:t xml:space="preserve"> strategic policy</w:t>
-            </w:r>
-            <w:r>
-              <w:rPr>
-                <w:rFonts w:asciiTheme="minorHAnsi" w:hAnsiTheme="minorHAnsi"/>
-                <w:sz w:val="20"/>
-                <w:szCs w:val="20"/>
-              </w:rPr>
-              <w:t xml:space="preserve"> – Part of a Cyber assurance team that audited multiple deployable squadrons on their asset management and cyber compliance within their workplace as well as delivering operational cyber training for deployments.</w:t>
-            </w:r>
-          </w:p>
-          <w:p>
-            <w:pPr>
-              <w:pStyle w:val="ListParagraph"/>
-              <w:rPr>
-                <w:rFonts w:asciiTheme="minorHAnsi" w:hAnsiTheme="minorHAnsi"/>
-                <w:sz w:val="20"/>
-                <w:szCs w:val="20"/>
-              </w:rPr>
-            </w:pPr>
+              <w:t xml:space="preserve"> – Conducted compliance audits across multiple deployable squadrons, assessing asset management and policy adherence. Delivered operational cyber training, translating complex technical requirements into practical guidance for non-technical audiences.</w:t>
+            </w:r>
           </w:p>
           <w:p>
             <w:pPr>
@@ -666,59 +733,23 @@
                 <w:numId w:val="4"/>
               </w:numPr>
               <w:rPr>
-                <w:rFonts w:asciiTheme="minorHAnsi" w:hAnsiTheme="minorHAnsi"/>
+                <w:rFonts w:ascii="Arial" w:hAnsi="Arial" w:cs="Arial"/>
                 <w:sz w:val="20"/>
                 <w:szCs w:val="20"/>
               </w:rPr>
             </w:pPr>
             <w:r>
               <w:rPr>
-                <w:rFonts w:asciiTheme="minorHAnsi" w:hAnsiTheme="minorHAnsi"/>
+                <w:rFonts w:ascii="Arial" w:hAnsi="Arial" w:cs="Arial"/>
                 <w:b/>
                 <w:sz w:val="20"/>
                 <w:szCs w:val="20"/>
               </w:rPr>
-              <w:t>Troubleshoot</w:t>
-            </w:r>
-            <w:r>
-              <w:rPr>
-                <w:rFonts w:asciiTheme="minorHAnsi" w:hAnsiTheme="minorHAnsi"/>
-                <w:b/>
-                <w:sz w:val="20"/>
-                <w:szCs w:val="20"/>
-              </w:rPr>
-              <w:t>ing</w:t>
-            </w:r>
-            <w:r>
-              <w:rPr>
-                <w:rFonts w:asciiTheme="minorHAnsi" w:hAnsiTheme="minorHAnsi"/>
-                <w:b/>
-                <w:sz w:val="20"/>
-                <w:szCs w:val="20"/>
-              </w:rPr>
-              <w:t xml:space="preserve"> and maintain</w:t>
-            </w:r>
-            <w:r>
-              <w:rPr>
-                <w:rFonts w:asciiTheme="minorHAnsi" w:hAnsiTheme="minorHAnsi"/>
-                <w:b/>
-                <w:sz w:val="20"/>
-                <w:szCs w:val="20"/>
-              </w:rPr>
-              <w:t>ing</w:t>
-            </w:r>
-            <w:r>
-              <w:rPr>
-                <w:rFonts w:asciiTheme="minorHAnsi" w:hAnsiTheme="minorHAnsi"/>
-                <w:b/>
-                <w:sz w:val="20"/>
-                <w:szCs w:val="20"/>
-              </w:rPr>
-              <w:t xml:space="preserve"> highly complex and sensitive networks</w:t>
-            </w:r>
-            <w:r>
-              <w:rPr>
-                <w:rFonts w:asciiTheme="minorHAnsi" w:hAnsiTheme="minorHAnsi"/>
+              <w:t>Infrastructure and data centre management</w:t>
+            </w:r>
+            <w:r>
+              <w:rPr>
+                <w:rFonts w:ascii="Arial" w:hAnsi="Arial" w:cs="Arial"/>
                 <w:bCs/>
                 <w:sz w:val="20"/>
                 <w:szCs w:val="20"/>
@@ -727,54 +758,12 @@
             </w:r>
             <w:r>
               <w:rPr>
-                <w:rFonts w:asciiTheme="minorHAnsi" w:hAnsiTheme="minorHAnsi"/>
+                <w:rFonts w:ascii="Arial" w:hAnsi="Arial" w:cs="Arial"/>
                 <w:sz w:val="20"/>
                 <w:szCs w:val="20"/>
               </w:rPr>
-              <w:t xml:space="preserve">– Competent enough to be the sole engineer through shift routine or normal day work maintaining over 650 network elements </w:t>
-            </w:r>
-            <w:r>
-              <w:rPr>
-                <w:rFonts w:asciiTheme="minorHAnsi" w:hAnsiTheme="minorHAnsi"/>
-                <w:sz w:val="20"/>
-                <w:szCs w:val="20"/>
-              </w:rPr>
-              <w:t>including</w:t>
-            </w:r>
-            <w:r>
-              <w:rPr>
-                <w:rFonts w:asciiTheme="minorHAnsi" w:hAnsiTheme="minorHAnsi"/>
-                <w:sz w:val="20"/>
-                <w:szCs w:val="20"/>
-              </w:rPr>
-              <w:t xml:space="preserve"> a data center </w:t>
-            </w:r>
-            <w:r>
-              <w:rPr>
-                <w:rFonts w:asciiTheme="minorHAnsi" w:hAnsiTheme="minorHAnsi"/>
-                <w:sz w:val="20"/>
-                <w:szCs w:val="20"/>
-              </w:rPr>
-              <w:t>and</w:t>
-            </w:r>
-            <w:r>
-              <w:rPr>
-                <w:rFonts w:asciiTheme="minorHAnsi" w:hAnsiTheme="minorHAnsi"/>
-                <w:sz w:val="20"/>
-                <w:szCs w:val="20"/>
-              </w:rPr>
-              <w:t xml:space="preserve"> a cloud network whist maintaining a high mission uptime.</w:t>
-            </w:r>
-          </w:p>
-          <w:p>
-            <w:pPr>
-              <w:pStyle w:val="ListParagraph"/>
-              <w:rPr>
-                <w:rFonts w:asciiTheme="minorHAnsi" w:hAnsiTheme="minorHAnsi"/>
-                <w:sz w:val="20"/>
-                <w:szCs w:val="20"/>
-              </w:rPr>
-            </w:pPr>
+              <w:t>– Sole engineer responsible for maintaining 650+ network elements including data centres and a cloud network, sustaining high mission uptime under operational pressure. Applied systematic fault analysis and structured problem-solving to complex, time-critical failures.</w:t>
+            </w:r>
           </w:p>
           <w:p>
             <w:pPr>
@@ -784,93 +773,38 @@
                 <w:numId w:val="4"/>
               </w:numPr>
               <w:rPr>
-                <w:rFonts w:asciiTheme="minorHAnsi" w:hAnsiTheme="minorHAnsi"/>
+                <w:rFonts w:ascii="Arial" w:hAnsi="Arial" w:cs="Arial"/>
                 <w:sz w:val="20"/>
                 <w:szCs w:val="20"/>
               </w:rPr>
             </w:pPr>
             <w:r>
               <w:rPr>
-                <w:rFonts w:asciiTheme="minorHAnsi" w:hAnsiTheme="minorHAnsi"/>
+                <w:rFonts w:ascii="Arial" w:hAnsi="Arial" w:cs="Arial"/>
                 <w:b/>
                 <w:bCs/>
                 <w:sz w:val="20"/>
                 <w:szCs w:val="20"/>
               </w:rPr>
-              <w:t>Work collaboratively as a global team and ensur</w:t>
-            </w:r>
-            <w:r>
-              <w:rPr>
-                <w:rFonts w:asciiTheme="minorHAnsi" w:hAnsiTheme="minorHAnsi"/>
-                <w:b/>
-                <w:bCs/>
+              <w:t>Cross-functional stakeholder communication</w:t>
+            </w:r>
+            <w:r>
+              <w:rPr>
+                <w:rFonts w:ascii="Arial" w:hAnsi="Arial" w:cs="Arial"/>
                 <w:sz w:val="20"/>
                 <w:szCs w:val="20"/>
               </w:rPr>
-              <w:t>ing</w:t>
-            </w:r>
-            <w:r>
-              <w:rPr>
-                <w:rFonts w:asciiTheme="minorHAnsi" w:hAnsiTheme="minorHAnsi"/>
-                <w:b/>
-                <w:bCs/>
+              <w:t xml:space="preserve"> – Coordinated technical </w:t>
+            </w:r>
+            <w:r>
+              <w:rPr>
+                <w:rFonts w:ascii="Arial" w:hAnsi="Arial" w:cs="Arial"/>
                 <w:sz w:val="20"/>
                 <w:szCs w:val="20"/>
               </w:rPr>
-              <w:t xml:space="preserve"> clear communications</w:t>
-            </w:r>
-            <w:r>
-              <w:rPr>
-                <w:rFonts w:asciiTheme="minorHAnsi" w:hAnsiTheme="minorHAnsi"/>
-                <w:sz w:val="20"/>
-                <w:szCs w:val="20"/>
-              </w:rPr>
-              <w:t xml:space="preserve"> – As part of a wider operational team I was able to carry out, and update commanding officers </w:t>
-            </w:r>
-            <w:r>
-              <w:rPr>
-                <w:rFonts w:asciiTheme="minorHAnsi" w:hAnsiTheme="minorHAnsi"/>
-                <w:sz w:val="20"/>
-                <w:szCs w:val="20"/>
-              </w:rPr>
-              <w:t>in</w:t>
-            </w:r>
-            <w:r>
-              <w:rPr>
-                <w:rFonts w:asciiTheme="minorHAnsi" w:hAnsiTheme="minorHAnsi"/>
-                <w:sz w:val="20"/>
-                <w:szCs w:val="20"/>
-              </w:rPr>
-              <w:t xml:space="preserve">form different parts of the world all aligning </w:t>
-            </w:r>
-            <w:r>
-              <w:rPr>
-                <w:rFonts w:asciiTheme="minorHAnsi" w:hAnsiTheme="minorHAnsi"/>
-                <w:sz w:val="20"/>
-                <w:szCs w:val="20"/>
-              </w:rPr>
-              <w:t xml:space="preserve">targets </w:t>
-            </w:r>
-            <w:r>
-              <w:rPr>
-                <w:rFonts w:asciiTheme="minorHAnsi" w:hAnsiTheme="minorHAnsi"/>
-                <w:sz w:val="20"/>
-                <w:szCs w:val="20"/>
-              </w:rPr>
-              <w:t>into one output.</w:t>
-            </w:r>
-          </w:p>
-          <w:p>
-            <w:pPr>
-              <w:pStyle w:val="ListParagraph"/>
-              <w:rPr>
-                <w:rFonts w:asciiTheme="minorHAnsi" w:hAnsiTheme="minorHAnsi"/>
-                <w:b/>
-                <w:bCs/>
-                <w:sz w:val="20"/>
-                <w:szCs w:val="20"/>
-              </w:rPr>
-            </w:pPr>
+              <w:lastRenderedPageBreak/>
+              <w:t>operations across a geographically distributed team, providing regular updates to commanding officers across multiple regions and aligning outputs to a single operational picture.</w:t>
+            </w:r>
           </w:p>
           <w:p>
             <w:pPr>
@@ -880,50 +814,39 @@
                 <w:numId w:val="4"/>
               </w:numPr>
               <w:rPr>
-                <w:rFonts w:asciiTheme="minorHAnsi" w:hAnsiTheme="minorHAnsi"/>
+                <w:rFonts w:ascii="Arial" w:hAnsi="Arial" w:cs="Arial"/>
                 <w:sz w:val="20"/>
                 <w:szCs w:val="20"/>
               </w:rPr>
             </w:pPr>
             <w:r>
               <w:rPr>
-                <w:rFonts w:asciiTheme="minorHAnsi" w:hAnsiTheme="minorHAnsi"/>
+                <w:rFonts w:ascii="Arial" w:hAnsi="Arial" w:cs="Arial"/>
                 <w:b/>
                 <w:bCs/>
                 <w:sz w:val="20"/>
                 <w:szCs w:val="20"/>
               </w:rPr>
-              <w:lastRenderedPageBreak/>
-              <w:t xml:space="preserve"> </w:t>
-            </w:r>
-            <w:r>
-              <w:rPr>
-                <w:rFonts w:asciiTheme="minorHAnsi" w:hAnsiTheme="minorHAnsi"/>
-                <w:b/>
-                <w:bCs/>
+              <w:t>Structured tooling and workflow management</w:t>
+            </w:r>
+            <w:r>
+              <w:rPr>
+                <w:rFonts w:ascii="Arial" w:hAnsi="Arial" w:cs="Arial"/>
                 <w:sz w:val="20"/>
                 <w:szCs w:val="20"/>
               </w:rPr>
-              <w:t>R</w:t>
-            </w:r>
-            <w:r>
-              <w:rPr>
-                <w:rFonts w:asciiTheme="minorHAnsi" w:hAnsiTheme="minorHAnsi"/>
-                <w:b/>
-                <w:bCs/>
+              <w:t xml:space="preserve"> – Used Jira and Confluence for task tracking, sprint planning, and documentation, alongside Grafana dashboards for real-time system monitoring and serviceability reporting. Supported structured, repeatable delivery in a fast-paced operational environment.</w:t>
+            </w:r>
+          </w:p>
+          <w:p>
+            <w:pPr>
+              <w:pStyle w:val="ListParagraph"/>
+              <w:rPr>
+                <w:rFonts w:ascii="Arial" w:hAnsi="Arial" w:cs="Arial"/>
                 <w:sz w:val="20"/>
                 <w:szCs w:val="20"/>
               </w:rPr>
-              <w:t>outine and structured workflows</w:t>
-            </w:r>
-            <w:r>
-              <w:rPr>
-                <w:rFonts w:asciiTheme="minorHAnsi" w:hAnsiTheme="minorHAnsi"/>
-                <w:sz w:val="20"/>
-                <w:szCs w:val="20"/>
-              </w:rPr>
-              <w:t xml:space="preserve"> – Using systems such as Jira/ confluence and Grafana to monitor task workflows and link to newly approaching projects whilst also monitoring systems serviceability on Grafana.</w:t>
-            </w:r>
+            </w:pPr>
           </w:p>
           <w:p>
             <w:pPr>
@@ -934,10 +857,32 @@
                 <w:numId w:val="0"/>
               </w:numPr>
               <w:rPr>
+                <w:rFonts w:ascii="Arial" w:hAnsi="Arial" w:cs="Arial"/>
+              </w:rPr>
+            </w:pPr>
+            <w:r>
+              <w:rPr>
+                <w:rFonts w:ascii="Arial" w:hAnsi="Arial" w:cs="Arial"/>
                 <w:b/>
                 <w:bCs/>
               </w:rPr>
-            </w:pPr>
+              <w:t xml:space="preserve">Personal projects - </w:t>
+            </w:r>
+            <w:hyperlink r:id="rId11" w:history="1">
+              <w:r>
+                <w:rPr>
+                  <w:rStyle w:val="Hyperlink"/>
+                  <w:rFonts w:ascii="Arial" w:hAnsi="Arial" w:cs="Arial"/>
+                </w:rPr>
+                <w:t>https://github.com/StanSouthwick/eportfolio_Stanley-Southwick</w:t>
+              </w:r>
+            </w:hyperlink>
+            <w:r>
+              <w:rPr>
+                <w:rFonts w:ascii="Arial" w:hAnsi="Arial" w:cs="Arial"/>
+              </w:rPr>
+              <w:t xml:space="preserve"> </w:t>
+            </w:r>
           </w:p>
           <w:p>
             <w:pPr>
@@ -947,23 +892,37 @@
                 <w:ilvl w:val="0"/>
                 <w:numId w:val="0"/>
               </w:numPr>
-            </w:pPr>
-            <w:r>
-              <w:rPr>
-                <w:b/>
-                <w:bCs/>
-              </w:rPr>
-              <w:t xml:space="preserve">Personal projects - </w:t>
-            </w:r>
-            <w:hyperlink r:id="rId11" w:history="1">
+              <w:rPr>
+                <w:rFonts w:ascii="Arial" w:hAnsi="Arial" w:cs="Arial"/>
+              </w:rPr>
+            </w:pPr>
+            <w:hyperlink r:id="rId12" w:history="1">
               <w:r>
                 <w:rPr>
                   <w:rStyle w:val="Hyperlink"/>
+                  <w:rFonts w:ascii="Arial" w:hAnsi="Arial" w:cs="Arial"/>
                 </w:rPr>
-                <w:t>https://github.com/StanSouthwick/eportfolio_Stanley-Southwick</w:t>
+                <w:t>https://github.com/StanSouthwick/eportfolio_Stanley-Southwick/tree</w:t>
+              </w:r>
+              <w:r>
+                <w:rPr>
+                  <w:rStyle w:val="Hyperlink"/>
+                  <w:rFonts w:ascii="Arial" w:hAnsi="Arial" w:cs="Arial"/>
+                </w:rPr>
+                <w:t>/</w:t>
+              </w:r>
+              <w:r>
+                <w:rPr>
+                  <w:rStyle w:val="Hyperlink"/>
+                  <w:rFonts w:ascii="Arial" w:hAnsi="Arial" w:cs="Arial"/>
+                </w:rPr>
+                <w:t>main/MSc%20AI/Exercises/Module%201%20-%20Computing/Unit%206</w:t>
               </w:r>
             </w:hyperlink>
             <w:r>
+              <w:rPr>
+                <w:rFonts w:ascii="Arial" w:hAnsi="Arial" w:cs="Arial"/>
+              </w:rPr>
               <w:t xml:space="preserve"> </w:t>
             </w:r>
           </w:p>
@@ -975,7 +934,22 @@
                 <w:ilvl w:val="0"/>
                 <w:numId w:val="0"/>
               </w:numPr>
-            </w:pPr>
+              <w:rPr>
+                <w:rFonts w:ascii="Arial" w:hAnsi="Arial" w:cs="Arial"/>
+              </w:rPr>
+            </w:pPr>
+            <w:r>
+              <w:rPr>
+                <w:rFonts w:ascii="Arial" w:hAnsi="Arial" w:cs="Arial"/>
+              </w:rPr>
+              <w:t xml:space="preserve">Built a production-grade network anomaly detector using the CICIDS 2017 dataset (2.8m entries) </w:t>
+            </w:r>
+            <w:r>
+              <w:rPr>
+                <w:rFonts w:ascii="Arial" w:hAnsi="Arial" w:cs="Arial"/>
+              </w:rPr>
+              <w:t xml:space="preserve">showing a full week of network traffic. This showcases the full machine-learning lifecycle starting at exploratory data analysis (EDA) and feature engineering all the way through to production deployment. Compared 4 different models (XGBoost, Random Forest, Isolation Forest, and TensorFlow DNN with all model results tracked in MLFlow. XGBoost was chosen for the main model achieving macro F1 score of 0.9 across the 14 attack classes. Inspected and tested through Jupyter notebooks into modular production Python scripts, containerised with Docker, and deployed via FastAPI inference API with model versioning and data drift monitoring. </w:t>
+            </w:r>
           </w:p>
           <w:p>
             <w:pPr>
@@ -985,18 +959,10 @@
                 <w:ilvl w:val="0"/>
                 <w:numId w:val="0"/>
               </w:numPr>
-            </w:pPr>
-            <w:hyperlink r:id="rId12" w:history="1">
-              <w:r>
-                <w:rPr>
-                  <w:rStyle w:val="Hyperlink"/>
-                </w:rPr>
-                <w:t>https://github.com/StanSouthwick/eportfolio_Stanley-Southwick/tree/main/MSc%20AI/Exercises/Module%201%20-%20Computing/Unit%206</w:t>
-              </w:r>
-            </w:hyperlink>
-            <w:r>
-              <w:t xml:space="preserve"> </w:t>
-            </w:r>
+              <w:rPr>
+                <w:rFonts w:ascii="Arial" w:hAnsi="Arial" w:cs="Arial"/>
+              </w:rPr>
+            </w:pPr>
           </w:p>
           <w:p>
             <w:pPr>
@@ -1007,8 +973,9 @@
                 <w:numId w:val="0"/>
               </w:numPr>
               <w:rPr>
-                <w:b/>
-                <w:bCs/>
+                <w:rFonts w:ascii="Arial" w:hAnsi="Arial" w:cs="Arial"/>
+                <w:sz w:val="13"/>
+                <w:szCs w:val="13"/>
               </w:rPr>
             </w:pPr>
           </w:p>
@@ -1020,20 +987,15 @@
                 <w:ilvl w:val="0"/>
                 <w:numId w:val="0"/>
               </w:numPr>
-            </w:pPr>
-            <w:r>
-              <w:t xml:space="preserve">Above </w:t>
-            </w:r>
-            <w:r>
-              <w:t xml:space="preserve">are links to my </w:t>
-            </w:r>
-            <w:proofErr w:type="spellStart"/>
-            <w:r>
-              <w:t>Github</w:t>
-            </w:r>
-            <w:proofErr w:type="spellEnd"/>
-            <w:r>
-              <w:t xml:space="preserve"> profile where I have created multiple projects some basic and some more in depth demonstrating using real-world dataset and ML pipelines, EDA, results tradeoff and extensive evaluation of models.</w:t>
+              <w:rPr>
+                <w:rFonts w:ascii="Arial" w:hAnsi="Arial" w:cs="Arial"/>
+              </w:rPr>
+            </w:pPr>
+            <w:r>
+              <w:rPr>
+                <w:rFonts w:ascii="Arial" w:hAnsi="Arial" w:cs="Arial"/>
+              </w:rPr>
+              <w:t xml:space="preserve">Other projects include Notebook Payment fraud detection, housing prices prediction using basic ML methods </w:t>
             </w:r>
           </w:p>
           <w:p>
@@ -1044,32 +1006,21 @@
                 <w:ilvl w:val="0"/>
                 <w:numId w:val="0"/>
               </w:numPr>
-            </w:pPr>
-            <w:r>
-              <w:t>Models from payment fraud detection, housing pricing prediction, and many more skill testing whilst looking to improve to help demonstrate real-world production to help bridge the transition gap through MSc AI and personal research.</w:t>
-            </w:r>
-          </w:p>
-          <w:p>
-            <w:pPr>
-              <w:pStyle w:val="Achievements"/>
-              <w:framePr w:hSpace="0" w:wrap="auto" w:vAnchor="margin" w:hAnchor="text" w:yAlign="inline"/>
-              <w:numPr>
-                <w:ilvl w:val="0"/>
-                <w:numId w:val="0"/>
-              </w:numPr>
-            </w:pPr>
-          </w:p>
-          <w:p>
-            <w:pPr>
-              <w:pStyle w:val="Achievements"/>
-              <w:framePr w:hSpace="0" w:wrap="auto" w:vAnchor="margin" w:hAnchor="text" w:yAlign="inline"/>
-              <w:numPr>
-                <w:ilvl w:val="0"/>
-                <w:numId w:val="0"/>
-              </w:numPr>
-            </w:pPr>
-            <w:r>
+              <w:rPr>
+                <w:rFonts w:ascii="Arial" w:hAnsi="Arial" w:cs="Arial"/>
+              </w:rPr>
+            </w:pPr>
+            <w:r>
+              <w:rPr>
+                <w:rFonts w:ascii="Arial" w:hAnsi="Arial" w:cs="Arial"/>
+              </w:rPr>
               <w:t xml:space="preserve">Skills gained: Production and deployed ML // AWS // Docker // API // Git // EDA </w:t>
+            </w:r>
+            <w:r>
+              <w:rPr>
+                <w:rFonts w:ascii="Arial" w:hAnsi="Arial" w:cs="Arial"/>
+              </w:rPr>
+              <w:t>// MLFlow // FastAPI // XGBoost // Imbalanced-Data // Python // Sci-kit learn // Feature analysis</w:t>
             </w:r>
           </w:p>
         </w:tc>
@@ -1080,7 +1031,13 @@
               <w:top w:val="single" w:sz="8" w:space="0" w:color="000000" w:themeColor="text1"/>
             </w:tcBorders>
           </w:tcPr>
-          <w:p/>
+          <w:p>
+            <w:pPr>
+              <w:rPr>
+                <w:rFonts w:ascii="Arial" w:hAnsi="Arial" w:cs="Arial"/>
+              </w:rPr>
+            </w:pPr>
+          </w:p>
         </w:tc>
       </w:tr>
       <w:tr>
@@ -1099,9 +1056,18 @@
           <w:p>
             <w:pPr>
               <w:pStyle w:val="Heading1"/>
-            </w:pPr>
-          </w:p>
-          <w:p/>
+              <w:rPr>
+                <w:rFonts w:ascii="Arial" w:hAnsi="Arial" w:cs="Arial"/>
+              </w:rPr>
+            </w:pPr>
+          </w:p>
+          <w:p>
+            <w:pPr>
+              <w:rPr>
+                <w:rFonts w:ascii="Arial" w:hAnsi="Arial" w:cs="Arial"/>
+              </w:rPr>
+            </w:pPr>
+          </w:p>
         </w:tc>
         <w:tc>
           <w:tcPr>
@@ -1111,7 +1077,13 @@
               <w:bottom w:val="single" w:sz="8" w:space="0" w:color="000000" w:themeColor="text1"/>
             </w:tcBorders>
           </w:tcPr>
-          <w:p/>
+          <w:p>
+            <w:pPr>
+              <w:rPr>
+                <w:rFonts w:ascii="Arial" w:hAnsi="Arial" w:cs="Arial"/>
+              </w:rPr>
+            </w:pPr>
+          </w:p>
         </w:tc>
         <w:tc>
           <w:tcPr>
@@ -1120,7 +1092,13 @@
               <w:bottom w:val="single" w:sz="8" w:space="0" w:color="000000" w:themeColor="text1"/>
             </w:tcBorders>
           </w:tcPr>
-          <w:p/>
+          <w:p>
+            <w:pPr>
+              <w:rPr>
+                <w:rFonts w:ascii="Arial" w:hAnsi="Arial" w:cs="Arial"/>
+              </w:rPr>
+            </w:pPr>
+          </w:p>
         </w:tc>
       </w:tr>
       <w:tr>
@@ -1138,9 +1116,15 @@
           <w:p>
             <w:pPr>
               <w:pStyle w:val="Heading2"/>
+              <w:rPr>
+                <w:rFonts w:ascii="Arial" w:hAnsi="Arial" w:cs="Arial"/>
+              </w:rPr>
             </w:pPr>
             <w:sdt>
               <w:sdtPr>
+                <w:rPr>
+                  <w:rFonts w:ascii="Arial" w:hAnsi="Arial" w:cs="Arial"/>
+                </w:rPr>
                 <w:id w:val="1208378480"/>
                 <w:placeholder>
                   <w:docPart w:val="2AB6A15F8C9344C29F554DC035D89CCD"/>
@@ -1151,6 +1135,9 @@
               </w:sdtPr>
               <w:sdtContent>
                 <w:r>
+                  <w:rPr>
+                    <w:rFonts w:ascii="Arial" w:hAnsi="Arial" w:cs="Arial"/>
+                  </w:rPr>
                   <w:t>Education</w:t>
                 </w:r>
               </w:sdtContent>
@@ -1169,8 +1156,14 @@
           <w:p>
             <w:pPr>
               <w:pStyle w:val="Heading3"/>
-            </w:pPr>
-            <w:r>
+              <w:rPr>
+                <w:rFonts w:ascii="Arial" w:hAnsi="Arial" w:cs="Arial"/>
+              </w:rPr>
+            </w:pPr>
+            <w:r>
+              <w:rPr>
+                <w:rFonts w:ascii="Arial" w:hAnsi="Arial" w:cs="Arial"/>
+              </w:rPr>
               <w:t>MSc AI</w:t>
             </w:r>
           </w:p>
@@ -1178,6 +1171,7 @@
             <w:pPr>
               <w:rPr>
                 <w:rStyle w:val="Strong"/>
+                <w:rFonts w:ascii="Arial" w:hAnsi="Arial" w:cs="Arial"/>
                 <w:b w:val="0"/>
                 <w:bCs w:val="0"/>
               </w:rPr>
@@ -1185,63 +1179,86 @@
             <w:r>
               <w:rPr>
                 <w:rStyle w:val="Strong"/>
+                <w:rFonts w:ascii="Arial" w:hAnsi="Arial" w:cs="Arial"/>
                 <w:b w:val="0"/>
                 <w:bCs w:val="0"/>
               </w:rPr>
-              <w:t>University of Essex</w:t>
-            </w:r>
-            <w:r>
+              <w:t>University of Essex // January 2026 – Spring 2028</w:t>
+            </w:r>
+          </w:p>
+          <w:p>
+            <w:pPr>
               <w:rPr>
                 <w:rStyle w:val="Strong"/>
+                <w:rFonts w:ascii="Arial" w:hAnsi="Arial" w:cs="Arial"/>
                 <w:b w:val="0"/>
                 <w:bCs w:val="0"/>
               </w:rPr>
-              <w:t xml:space="preserve"> // January 2026 – Spring 2028</w:t>
-            </w:r>
-          </w:p>
-          <w:p>
-            <w:pPr>
+            </w:pPr>
+            <w:r>
               <w:rPr>
                 <w:rStyle w:val="Strong"/>
+                <w:rFonts w:ascii="Arial" w:hAnsi="Arial" w:cs="Arial"/>
                 <w:b w:val="0"/>
                 <w:bCs w:val="0"/>
               </w:rPr>
-            </w:pPr>
-            <w:r>
+              <w:t>Current modules: ML fundamentals, neural networks, data engineering // Python // scikit-learn // Pandas // NumPy</w:t>
+            </w:r>
+          </w:p>
+          <w:p>
+            <w:pPr>
               <w:rPr>
                 <w:rStyle w:val="Strong"/>
+                <w:rFonts w:ascii="Arial" w:hAnsi="Arial" w:cs="Arial"/>
+              </w:rPr>
+            </w:pPr>
+            <w:r>
+              <w:rPr>
+                <w:rStyle w:val="Strong"/>
+                <w:rFonts w:ascii="Arial" w:hAnsi="Arial" w:cs="Arial"/>
+              </w:rPr>
+              <w:t xml:space="preserve">Certificate of higher education – Level 4 </w:t>
+            </w:r>
+          </w:p>
+          <w:p>
+            <w:pPr>
+              <w:rPr>
+                <w:rStyle w:val="Strong"/>
+                <w:rFonts w:ascii="Arial" w:hAnsi="Arial" w:cs="Arial"/>
                 <w:b w:val="0"/>
                 <w:bCs w:val="0"/>
               </w:rPr>
-              <w:t>Skills gained: Python // scikit-learn // ML production // Pandas</w:t>
-            </w:r>
-          </w:p>
-          <w:p>
-            <w:pPr>
+            </w:pPr>
+            <w:r>
               <w:rPr>
                 <w:rStyle w:val="Strong"/>
+                <w:rFonts w:ascii="Arial" w:hAnsi="Arial" w:cs="Arial"/>
                 <w:b w:val="0"/>
                 <w:bCs w:val="0"/>
               </w:rPr>
-            </w:pPr>
+              <w:t>Open University // 2023-2025</w:t>
+            </w:r>
           </w:p>
           <w:p>
             <w:pPr>
               <w:rPr>
                 <w:rStyle w:val="Strong"/>
+                <w:rFonts w:ascii="Arial" w:hAnsi="Arial" w:cs="Arial"/>
               </w:rPr>
             </w:pPr>
             <w:r>
               <w:rPr>
                 <w:rStyle w:val="Strong"/>
-              </w:rPr>
-              <w:t xml:space="preserve">Certificate of higher education – Level 4 </w:t>
+                <w:rFonts w:ascii="Arial" w:hAnsi="Arial" w:cs="Arial"/>
+              </w:rPr>
+              <w:t>Unified communications technician – Level 3</w:t>
             </w:r>
           </w:p>
           <w:p>
             <w:pPr>
               <w:rPr>
                 <w:rStyle w:val="Strong"/>
+                <w:rFonts w:ascii="Arial" w:hAnsi="Arial" w:cs="Arial"/>
                 <w:b w:val="0"/>
                 <w:bCs w:val="0"/>
               </w:rPr>
@@ -1249,64 +1266,18 @@
             <w:r>
               <w:rPr>
                 <w:rStyle w:val="Strong"/>
+                <w:rFonts w:ascii="Arial" w:hAnsi="Arial" w:cs="Arial"/>
                 <w:b w:val="0"/>
                 <w:bCs w:val="0"/>
               </w:rPr>
-              <w:t>Open University // 2023-2025</w:t>
+              <w:t>Feb 2021 – December 2021</w:t>
             </w:r>
           </w:p>
           <w:p>
             <w:pPr>
               <w:rPr>
                 <w:rStyle w:val="Strong"/>
-                <w:b w:val="0"/>
-                <w:bCs w:val="0"/>
-              </w:rPr>
-            </w:pPr>
-          </w:p>
-          <w:p>
-            <w:pPr>
-              <w:rPr>
-                <w:rStyle w:val="Strong"/>
-              </w:rPr>
-            </w:pPr>
-            <w:r>
-              <w:rPr>
-                <w:rStyle w:val="Strong"/>
-              </w:rPr>
-              <w:t>Unified communications technician – Level 3</w:t>
-            </w:r>
-          </w:p>
-          <w:p>
-            <w:pPr>
-              <w:rPr>
-                <w:rStyle w:val="Strong"/>
-                <w:b w:val="0"/>
-                <w:bCs w:val="0"/>
-              </w:rPr>
-            </w:pPr>
-            <w:r>
-              <w:rPr>
-                <w:rStyle w:val="Strong"/>
-                <w:b w:val="0"/>
-                <w:bCs w:val="0"/>
-              </w:rPr>
-              <w:t>Feb 2021 – December 2021</w:t>
-            </w:r>
-          </w:p>
-          <w:p>
-            <w:pPr>
-              <w:rPr>
-                <w:rStyle w:val="Strong"/>
-                <w:b w:val="0"/>
-                <w:bCs w:val="0"/>
-              </w:rPr>
-            </w:pPr>
-          </w:p>
-          <w:p>
-            <w:pPr>
-              <w:rPr>
-                <w:rStyle w:val="Strong"/>
+                <w:rFonts w:ascii="Arial" w:hAnsi="Arial" w:cs="Arial"/>
                 <w:b w:val="0"/>
                 <w:bCs w:val="0"/>
                 <w:lang w:val="en-GB"/>
@@ -1315,18 +1286,14 @@
             <w:r>
               <w:rPr>
                 <w:rStyle w:val="Strong"/>
-              </w:rPr>
-              <w:t xml:space="preserve">Multiple industry </w:t>
+                <w:rFonts w:ascii="Arial" w:hAnsi="Arial" w:cs="Arial"/>
+              </w:rPr>
+              <w:t>Multiple industry certifications</w:t>
             </w:r>
             <w:r>
               <w:rPr>
                 <w:rStyle w:val="Strong"/>
-              </w:rPr>
-              <w:t>certifications</w:t>
-            </w:r>
-            <w:r>
-              <w:rPr>
-                <w:rStyle w:val="Strong"/>
+                <w:rFonts w:ascii="Arial" w:hAnsi="Arial" w:cs="Arial"/>
                 <w:b w:val="0"/>
                 <w:bCs w:val="0"/>
               </w:rPr>
@@ -1335,6 +1302,7 @@
             <w:r>
               <w:rPr>
                 <w:rStyle w:val="Strong"/>
+                <w:rFonts w:ascii="Arial" w:hAnsi="Arial" w:cs="Arial"/>
                 <w:b w:val="0"/>
                 <w:bCs w:val="0"/>
                 <w:lang w:val="en-GB"/>
@@ -1345,6 +1313,7 @@
               <w:r>
                 <w:rPr>
                   <w:rStyle w:val="Hyperlink"/>
+                  <w:rFonts w:ascii="Arial" w:hAnsi="Arial" w:cs="Arial"/>
                   <w:lang w:val="en-GB"/>
                 </w:rPr>
                 <w:t>https://www.credly.com/users/stanley-james-southwick</w:t>
@@ -1353,6 +1322,7 @@
             <w:r>
               <w:rPr>
                 <w:rStyle w:val="Strong"/>
+                <w:rFonts w:ascii="Arial" w:hAnsi="Arial" w:cs="Arial"/>
                 <w:b w:val="0"/>
                 <w:bCs w:val="0"/>
                 <w:lang w:val="en-GB"/>
@@ -1364,6 +1334,7 @@
             <w:pPr>
               <w:rPr>
                 <w:rStyle w:val="Strong"/>
+                <w:rFonts w:ascii="Arial" w:hAnsi="Arial" w:cs="Arial"/>
               </w:rPr>
             </w:pPr>
           </w:p>
@@ -1371,101 +1342,49 @@
             <w:pPr>
               <w:rPr>
                 <w:rStyle w:val="Strong"/>
+                <w:rFonts w:ascii="Arial" w:hAnsi="Arial" w:cs="Arial"/>
                 <w:b w:val="0"/>
                 <w:bCs w:val="0"/>
                 <w:lang w:val="en-GB"/>
               </w:rPr>
             </w:pPr>
-            <w:proofErr w:type="spellStart"/>
             <w:r>
               <w:rPr>
                 <w:rStyle w:val="Strong"/>
+                <w:rFonts w:ascii="Arial" w:hAnsi="Arial" w:cs="Arial"/>
                 <w:b w:val="0"/>
                 <w:bCs w:val="0"/>
                 <w:lang w:val="en-GB"/>
               </w:rPr>
-              <w:t>AgilePM</w:t>
-            </w:r>
-            <w:proofErr w:type="spellEnd"/>
-            <w:r>
+              <w:t>AgilePM // Cisco SWRE // COMP TIA Sec+ // PCEP // RedHat Administrator</w:t>
+            </w:r>
+          </w:p>
+          <w:p>
+            <w:pPr>
               <w:rPr>
                 <w:rStyle w:val="Strong"/>
+                <w:rFonts w:ascii="Arial" w:hAnsi="Arial" w:cs="Arial"/>
                 <w:b w:val="0"/>
                 <w:bCs w:val="0"/>
                 <w:lang w:val="en-GB"/>
               </w:rPr>
-              <w:t xml:space="preserve"> // Cisco </w:t>
-            </w:r>
+            </w:pPr>
             <w:r>
               <w:rPr>
                 <w:rStyle w:val="Strong"/>
+                <w:rFonts w:ascii="Arial" w:hAnsi="Arial" w:cs="Arial"/>
                 <w:b w:val="0"/>
                 <w:bCs w:val="0"/>
                 <w:lang w:val="en-GB"/>
               </w:rPr>
-              <w:t xml:space="preserve">SWRE </w:t>
-            </w:r>
-            <w:r>
+              <w:t xml:space="preserve"> </w:t>
+            </w:r>
+          </w:p>
+          <w:p>
+            <w:pPr>
               <w:rPr>
                 <w:rStyle w:val="Strong"/>
-                <w:b w:val="0"/>
-                <w:bCs w:val="0"/>
-                <w:lang w:val="en-GB"/>
-              </w:rPr>
-              <w:t>/</w:t>
-            </w:r>
-            <w:r>
-              <w:rPr>
-                <w:rStyle w:val="Strong"/>
-                <w:b w:val="0"/>
-                <w:bCs w:val="0"/>
-                <w:lang w:val="en-GB"/>
-              </w:rPr>
-              <w:t>/ COMP TIA Sec+ // PCEP // RedHat Admin</w:t>
-            </w:r>
-            <w:r>
-              <w:rPr>
-                <w:rStyle w:val="Strong"/>
-                <w:b w:val="0"/>
-                <w:bCs w:val="0"/>
-                <w:lang w:val="en-GB"/>
-              </w:rPr>
-              <w:t>istrator</w:t>
-            </w:r>
-          </w:p>
-          <w:p>
-            <w:pPr>
-              <w:rPr>
-                <w:rStyle w:val="Strong"/>
-                <w:b w:val="0"/>
-                <w:bCs w:val="0"/>
-                <w:lang w:val="en-GB"/>
-              </w:rPr>
-            </w:pPr>
-            <w:r>
-              <w:rPr>
-                <w:rStyle w:val="Strong"/>
-                <w:b w:val="0"/>
-                <w:bCs w:val="0"/>
-                <w:lang w:val="en-GB"/>
-              </w:rPr>
-              <w:t xml:space="preserve"> </w:t>
-            </w:r>
-          </w:p>
-          <w:p>
-            <w:pPr>
-              <w:rPr>
-                <w:rStyle w:val="Strong"/>
-                <w:b w:val="0"/>
-                <w:bCs w:val="0"/>
-                <w:lang w:val="en-GB"/>
-              </w:rPr>
-            </w:pPr>
-          </w:p>
-          <w:p>
-            <w:pPr>
-              <w:rPr>
-                <w:rStyle w:val="Strong"/>
+                <w:rFonts w:ascii="Arial" w:hAnsi="Arial" w:cs="Arial"/>
                 <w:b w:val="0"/>
                 <w:bCs w:val="0"/>
                 <w:lang w:val="en-GB"/>
@@ -1489,34 +1408,17 @@
           <w:p>
             <w:pPr>
               <w:pStyle w:val="Heading2"/>
-            </w:pPr>
-            <w:r>
-              <w:rPr>
+              <w:rPr>
+                <w:rFonts w:ascii="Arial" w:hAnsi="Arial" w:cs="Arial"/>
+              </w:rPr>
+            </w:pPr>
+            <w:r>
+              <w:rPr>
+                <w:rFonts w:ascii="Arial" w:hAnsi="Arial" w:cs="Arial"/>
                 <w:sz w:val="18"/>
                 <w:szCs w:val="18"/>
               </w:rPr>
-              <w:t>per</w:t>
-            </w:r>
-            <w:r>
-              <w:rPr>
-                <w:sz w:val="18"/>
-                <w:szCs w:val="18"/>
-              </w:rPr>
-              <w:t xml:space="preserve">sonal </w:t>
-            </w:r>
-            <w:r>
-              <w:rPr>
-                <w:sz w:val="18"/>
-                <w:szCs w:val="18"/>
-              </w:rPr>
-              <w:t>achievment</w:t>
-            </w:r>
-            <w:r>
-              <w:rPr>
-                <w:sz w:val="18"/>
-                <w:szCs w:val="18"/>
-              </w:rPr>
-              <w:t>s</w:t>
+              <w:t>personal achievments</w:t>
             </w:r>
           </w:p>
         </w:tc>
@@ -1529,57 +1431,72 @@
             </w:tcBorders>
           </w:tcPr>
           <w:p>
-            <w:r>
-              <w:rPr>
+            <w:pPr>
+              <w:rPr>
+                <w:rFonts w:ascii="Arial" w:hAnsi="Arial" w:cs="Arial"/>
+              </w:rPr>
+            </w:pPr>
+            <w:r>
+              <w:rPr>
+                <w:rFonts w:ascii="Arial" w:hAnsi="Arial" w:cs="Arial"/>
                 <w:b/>
                 <w:bCs/>
               </w:rPr>
               <w:t xml:space="preserve">Commendation </w:t>
             </w:r>
             <w:r>
+              <w:rPr>
+                <w:rFonts w:ascii="Arial" w:hAnsi="Arial" w:cs="Arial"/>
+              </w:rPr>
               <w:t>for Performance on overseas deployment from Commanding Officer</w:t>
             </w:r>
           </w:p>
           <w:p>
             <w:pPr>
               <w:rPr>
+                <w:rFonts w:ascii="Arial" w:hAnsi="Arial" w:cs="Arial"/>
                 <w:b/>
                 <w:bCs/>
               </w:rPr>
             </w:pPr>
             <w:r>
               <w:rPr>
+                <w:rFonts w:ascii="Arial" w:hAnsi="Arial" w:cs="Arial"/>
                 <w:b/>
                 <w:bCs/>
               </w:rPr>
-              <w:lastRenderedPageBreak/>
               <w:t>2 X Manchester Marathon</w:t>
             </w:r>
           </w:p>
           <w:p>
             <w:pPr>
               <w:rPr>
+                <w:rFonts w:ascii="Arial" w:hAnsi="Arial" w:cs="Arial"/>
                 <w:b/>
                 <w:bCs/>
               </w:rPr>
             </w:pPr>
             <w:r>
               <w:rPr>
+                <w:rFonts w:ascii="Arial" w:hAnsi="Arial" w:cs="Arial"/>
                 <w:b/>
                 <w:bCs/>
               </w:rPr>
+              <w:lastRenderedPageBreak/>
               <w:t xml:space="preserve">UK national 3 Peak challenge </w:t>
             </w:r>
           </w:p>
           <w:p>
             <w:pPr>
               <w:rPr>
+                <w:rFonts w:ascii="Arial" w:hAnsi="Arial" w:cs="Arial"/>
                 <w:b/>
                 <w:bCs/>
               </w:rPr>
             </w:pPr>
             <w:r>
               <w:rPr>
+                <w:rFonts w:ascii="Arial" w:hAnsi="Arial" w:cs="Arial"/>
                 <w:b/>
                 <w:bCs/>
               </w:rPr>
@@ -1589,6 +1506,7 @@
           <w:p>
             <w:pPr>
               <w:rPr>
+                <w:rFonts w:ascii="Arial" w:hAnsi="Arial" w:cs="Arial"/>
                 <w:b/>
                 <w:bCs/>
               </w:rPr>
@@ -3227,7 +3145,7 @@
     <w:charset w:val="02"/>
     <w:family w:val="decorative"/>
     <w:pitch w:val="variable"/>
-    <w:sig w:usb0="00000003" w:usb1="10000000" w:usb2="00000000" w:usb3="00000000" w:csb0="80000001" w:csb1="00000000"/>
+    <w:sig w:usb0="00000000" w:usb1="10000000" w:usb2="00000000" w:usb3="00000000" w:csb0="80000000" w:csb1="00000000"/>
   </w:font>
   <w:font w:name="Times New Roman">
     <w:panose1 w:val="02020603050405020304"/>
@@ -3241,7 +3159,7 @@
     <w:charset w:val="00"/>
     <w:family w:val="modern"/>
     <w:pitch w:val="fixed"/>
-    <w:sig w:usb0="E0002AFF" w:usb1="C0007843" w:usb2="00000009" w:usb3="00000000" w:csb0="000001FF" w:csb1="00000000"/>
+    <w:sig w:usb0="E0002EFF" w:usb1="C0007843" w:usb2="00000009" w:usb3="00000000" w:csb0="000001FF" w:csb1="00000000"/>
   </w:font>
   <w:font w:name="Wingdings">
     <w:panose1 w:val="05000000000000000000"/>
@@ -3295,6 +3213,13 @@
     <w:pitch w:val="variable"/>
     <w:sig w:usb0="00000003" w:usb1="00000000" w:usb2="00000000" w:usb3="00000000" w:csb0="00000001" w:csb1="00000000"/>
   </w:font>
+  <w:font w:name="Arial">
+    <w:panose1 w:val="020B0604020202020204"/>
+    <w:charset w:val="00"/>
+    <w:family w:val="swiss"/>
+    <w:pitch w:val="variable"/>
+    <w:sig w:usb0="E0002EFF" w:usb1="C000785B" w:usb2="00000009" w:usb3="00000000" w:csb0="000001FF" w:csb1="00000000"/>
+  </w:font>
   <w:font w:name="Aptos">
     <w:panose1 w:val="020B0004020202020204"/>
     <w:charset w:val="00"/>
@@ -3309,13 +3234,6 @@
     <w:family w:val="auto"/>
     <w:pitch w:val="variable"/>
     <w:sig w:usb0="A00002BF" w:usb1="38CF7CFA" w:usb2="00000016" w:usb3="00000000" w:csb0="0004000F" w:csb1="00000000"/>
-  </w:font>
-  <w:font w:name="Arial">
-    <w:panose1 w:val="020B0604020202020204"/>
-    <w:charset w:val="00"/>
-    <w:family w:val="swiss"/>
-    <w:pitch w:val="variable"/>
-    <w:sig w:usb0="E0002AFF" w:usb1="C0007843" w:usb2="00000009" w:usb3="00000000" w:csb0="000001FF" w:csb1="00000000"/>
   </w:font>
   <w:font w:name="DengXian Light">
     <w:altName w:val="等线 Light"/>
@@ -3708,6 +3626,7 @@
     <w:rsidRoot w:val="009A02C3"/>
     <w:rsid w:val="000437C6"/>
     <w:rsid w:val="000F0D8A"/>
+    <w:rsid w:val="001768E9"/>
     <w:rsid w:val="0018712C"/>
     <w:rsid w:val="00190316"/>
     <w:rsid w:val="001A40CF"/>
@@ -3743,6 +3662,7 @@
     <w:rsid w:val="00D36418"/>
     <w:rsid w:val="00D71DDB"/>
     <w:rsid w:val="00D7500D"/>
+    <w:rsid w:val="00D82256"/>
     <w:rsid w:val="00E16B08"/>
     <w:rsid w:val="00E51FAD"/>
     <w:rsid w:val="00EC5221"/>
@@ -4222,62 +4142,6 @@
       <w:bCs/>
     </w:rPr>
   </w:style>
-  <w:style w:type="paragraph" w:customStyle="1" w:styleId="38A45E95654E3F4CB687E769B0D3CDEF">
-    <w:name w:val="38A45E95654E3F4CB687E769B0D3CDEF"/>
-    <w:rsid w:val="007F2C07"/>
-    <w:pPr>
-      <w:spacing w:line="278" w:lineRule="auto"/>
-    </w:pPr>
-    <w:rPr>
-      <w:kern w:val="2"/>
-      <w:sz w:val="24"/>
-      <w:szCs w:val="24"/>
-      <w:lang w:val="en-GB" w:eastAsia="zh-CN"/>
-      <w14:ligatures w14:val="standardContextual"/>
-    </w:rPr>
-  </w:style>
-  <w:style w:type="paragraph" w:customStyle="1" w:styleId="27336539FF64D4438DDBCD33AA657AFF">
-    <w:name w:val="27336539FF64D4438DDBCD33AA657AFF"/>
-    <w:rsid w:val="007F2C07"/>
-    <w:pPr>
-      <w:spacing w:line="278" w:lineRule="auto"/>
-    </w:pPr>
-    <w:rPr>
-      <w:kern w:val="2"/>
-      <w:sz w:val="24"/>
-      <w:szCs w:val="24"/>
-      <w:lang w:val="en-GB" w:eastAsia="zh-CN"/>
-      <w14:ligatures w14:val="standardContextual"/>
-    </w:rPr>
-  </w:style>
-  <w:style w:type="paragraph" w:customStyle="1" w:styleId="5CFD5DAD3736024EB03F52F568C9FD69">
-    <w:name w:val="5CFD5DAD3736024EB03F52F568C9FD69"/>
-    <w:rsid w:val="007F2C07"/>
-    <w:pPr>
-      <w:spacing w:line="278" w:lineRule="auto"/>
-    </w:pPr>
-    <w:rPr>
-      <w:kern w:val="2"/>
-      <w:sz w:val="24"/>
-      <w:szCs w:val="24"/>
-      <w:lang w:val="en-GB" w:eastAsia="zh-CN"/>
-      <w14:ligatures w14:val="standardContextual"/>
-    </w:rPr>
-  </w:style>
-  <w:style w:type="paragraph" w:customStyle="1" w:styleId="66FE53E3443BCD4E822AFC82BFD6A79C">
-    <w:name w:val="66FE53E3443BCD4E822AFC82BFD6A79C"/>
-    <w:rsid w:val="007F2C07"/>
-    <w:pPr>
-      <w:spacing w:line="278" w:lineRule="auto"/>
-    </w:pPr>
-    <w:rPr>
-      <w:kern w:val="2"/>
-      <w:sz w:val="24"/>
-      <w:szCs w:val="24"/>
-      <w:lang w:val="en-GB" w:eastAsia="zh-CN"/>
-      <w14:ligatures w14:val="standardContextual"/>
-    </w:rPr>
-  </w:style>
 </w:styles>
 </file>
 
@@ -4523,7 +4387,23 @@
 </file>
 
 <file path=customXml/item2.xml><?xml version="1.0" encoding="utf-8"?>
-<b:Sources xmlns:b="http://schemas.openxmlformats.org/officeDocument/2006/bibliography" xmlns="http://schemas.openxmlformats.org/officeDocument/2006/bibliography" SelectedStyle="\APASixthEditionOfficeOnline.xsl" StyleName="APA" Version="6"/>
+<p:properties xmlns:p="http://schemas.microsoft.com/office/2006/metadata/properties" xmlns:xsi="http://www.w3.org/2001/XMLSchema-instance" xmlns:pc="http://schemas.microsoft.com/office/infopath/2007/PartnerControls">
+  <documentManagement>
+    <_ip_UnifiedCompliancePolicyUIAction xmlns="http://schemas.microsoft.com/sharepoint/v3" xsi:nil="true"/>
+    <Image xmlns="71af3243-3dd4-4a8d-8c0d-dd76da1f02a5">
+      <Url xsi:nil="true"/>
+      <Description xsi:nil="true"/>
+    </Image>
+    <Status xmlns="71af3243-3dd4-4a8d-8c0d-dd76da1f02a5">Not started</Status>
+    <Background xmlns="71af3243-3dd4-4a8d-8c0d-dd76da1f02a5">false</Background>
+    <_ip_UnifiedCompliancePolicyProperties xmlns="http://schemas.microsoft.com/sharepoint/v3" xsi:nil="true"/>
+    <ImageTagsTaxHTField xmlns="71af3243-3dd4-4a8d-8c0d-dd76da1f02a5">
+      <Terms xmlns="http://schemas.microsoft.com/office/infopath/2007/PartnerControls"/>
+    </ImageTagsTaxHTField>
+    <TaxCatchAll xmlns="230e9df3-be65-4c73-a93b-d1236ebd677e" xsi:nil="true"/>
+    <MediaServiceKeyPoints xmlns="71af3243-3dd4-4a8d-8c0d-dd76da1f02a5" xsi:nil="true"/>
+  </documentManagement>
+</p:properties>
 </file>
 
 <file path=customXml/item3.xml><?xml version="1.0" encoding="utf-8"?>
@@ -4839,23 +4719,7 @@
 </file>
 
 <file path=customXml/item4.xml><?xml version="1.0" encoding="utf-8"?>
-<p:properties xmlns:p="http://schemas.microsoft.com/office/2006/metadata/properties" xmlns:xsi="http://www.w3.org/2001/XMLSchema-instance" xmlns:pc="http://schemas.microsoft.com/office/infopath/2007/PartnerControls">
-  <documentManagement>
-    <_ip_UnifiedCompliancePolicyUIAction xmlns="http://schemas.microsoft.com/sharepoint/v3" xsi:nil="true"/>
-    <Image xmlns="71af3243-3dd4-4a8d-8c0d-dd76da1f02a5">
-      <Url xsi:nil="true"/>
-      <Description xsi:nil="true"/>
-    </Image>
-    <Status xmlns="71af3243-3dd4-4a8d-8c0d-dd76da1f02a5">Not started</Status>
-    <Background xmlns="71af3243-3dd4-4a8d-8c0d-dd76da1f02a5">false</Background>
-    <_ip_UnifiedCompliancePolicyProperties xmlns="http://schemas.microsoft.com/sharepoint/v3" xsi:nil="true"/>
-    <ImageTagsTaxHTField xmlns="71af3243-3dd4-4a8d-8c0d-dd76da1f02a5">
-      <Terms xmlns="http://schemas.microsoft.com/office/infopath/2007/PartnerControls"/>
-    </ImageTagsTaxHTField>
-    <TaxCatchAll xmlns="230e9df3-be65-4c73-a93b-d1236ebd677e" xsi:nil="true"/>
-    <MediaServiceKeyPoints xmlns="71af3243-3dd4-4a8d-8c0d-dd76da1f02a5" xsi:nil="true"/>
-  </documentManagement>
-</p:properties>
+<b:Sources xmlns:b="http://schemas.openxmlformats.org/officeDocument/2006/bibliography" xmlns="http://schemas.openxmlformats.org/officeDocument/2006/bibliography" SelectedStyle="\APASixthEditionOfficeOnline.xsl" StyleName="APA" Version="6"/>
 </file>
 
 <file path=customXml/itemProps1.xml><?xml version="1.0" encoding="utf-8"?>
@@ -4867,9 +4731,13 @@
 </file>
 
 <file path=customXml/itemProps2.xml><?xml version="1.0" encoding="utf-8"?>
-<ds:datastoreItem xmlns:ds="http://schemas.openxmlformats.org/officeDocument/2006/customXml" ds:itemID="{4393FE75-A2BB-4EBE-A5B4-C921FF265B1F}">
+<ds:datastoreItem xmlns:ds="http://schemas.openxmlformats.org/officeDocument/2006/customXml" ds:itemID="{01BCC526-0122-4705-A4ED-BCB7A88806CF}">
   <ds:schemaRefs>
-    <ds:schemaRef ds:uri="http://schemas.openxmlformats.org/officeDocument/2006/bibliography"/>
+    <ds:schemaRef ds:uri="http://schemas.microsoft.com/office/2006/metadata/properties"/>
+    <ds:schemaRef ds:uri="http://schemas.microsoft.com/office/infopath/2007/PartnerControls"/>
+    <ds:schemaRef ds:uri="http://schemas.microsoft.com/sharepoint/v3"/>
+    <ds:schemaRef ds:uri="71af3243-3dd4-4a8d-8c0d-dd76da1f02a5"/>
+    <ds:schemaRef ds:uri="230e9df3-be65-4c73-a93b-d1236ebd677e"/>
   </ds:schemaRefs>
 </ds:datastoreItem>
 </file>
@@ -4896,13 +4764,9 @@
 </file>
 
 <file path=customXml/itemProps4.xml><?xml version="1.0" encoding="utf-8"?>
-<ds:datastoreItem xmlns:ds="http://schemas.openxmlformats.org/officeDocument/2006/customXml" ds:itemID="{01BCC526-0122-4705-A4ED-BCB7A88806CF}">
+<ds:datastoreItem xmlns:ds="http://schemas.openxmlformats.org/officeDocument/2006/customXml" ds:itemID="{4393FE75-A2BB-4EBE-A5B4-C921FF265B1F}">
   <ds:schemaRefs>
-    <ds:schemaRef ds:uri="http://schemas.microsoft.com/office/2006/metadata/properties"/>
-    <ds:schemaRef ds:uri="http://schemas.microsoft.com/office/infopath/2007/PartnerControls"/>
-    <ds:schemaRef ds:uri="http://schemas.microsoft.com/sharepoint/v3"/>
-    <ds:schemaRef ds:uri="71af3243-3dd4-4a8d-8c0d-dd76da1f02a5"/>
-    <ds:schemaRef ds:uri="230e9df3-be65-4c73-a93b-d1236ebd677e"/>
+    <ds:schemaRef ds:uri="http://schemas.openxmlformats.org/officeDocument/2006/bibliography"/>
   </ds:schemaRefs>
 </ds:datastoreItem>
 </file>

</xml_diff>